<commit_message>
Keep the replace dialog's controls inside the dialog
The dropdowns were painting past the right edge of the dialog. SelectTrigger
ships as w-fit with whitespace-nowrap, so it grows to whatever its label
needs - and "Banquet Chair - White (CHR-DEMO-2603-0001) — 420 available ·
covers this line" is far wider than a 512px dialog. Both triggers are now
w-full, and the option renders the name on one line with the code and
availability beneath, so a long item name can no longer widen the control.

The dialog itself takes w-[95vw] with overflow hidden, so the frame cannot
exceed the viewport and nothing can paint outside it. Measured after the
fix: 0 elements extending past the dialog bounds, against 4 before.

Also brings in the script rebuilt earlier - section 4.5 now demonstrates
partial damage rather than calling it a limitation, and gains the answer
for why the replacement is picked from stock rather than typed.

Co-Authored-By: Claude <noreply@anthropic.com>
</commit_message>
<xml_diff>
--- a/docs/Panel-Demo-Script-4-and-5.docx
+++ b/docs/Panel-Demo-Script-4-and-5.docx
@@ -1247,7 +1247,7 @@
           <w:sz w:val="28"/>
           <w:szCs w:val="28"/>
         </w:rPr>
-        <w:t xml:space="preserve">4.5 The Limitation to State Before You Are Asked</w:t>
+        <w:t xml:space="preserve">4.5 Partial Damage</w:t>
       </w:r>
     </w:p>
     <w:p>
@@ -1265,7 +1265,87 @@
           <w:sz w:val="24"/>
           <w:szCs w:val="24"/>
         </w:rPr>
-        <w:t xml:space="preserve">One thing we want to be upfront about. The incident records the whole line item, not a partial count. If twelve of a hundred and eighty napkins are stained, the department replaces the line and the incident carries the full quantity. Splitting a line into a damaged part and an intact part is a larger change to the record, and we did not attempt it inside this revision window.</w:t>
+        <w:t xml:space="preserve">Damage is rarely the whole line. If twelve of sixty runners are stained, we enter twelve — and the system splits the line: forty-eight keep the original item and stay prepared, and only the twelve replacements go back to pending. The total the event receives never changes, which is the freeze’s whole concern.</w:t>
+      </w:r>
+    </w:p>
+    <w:p>
+      <w:pPr>
+        <w:spacing w:after="100"/>
+        <w:ind w:left="340"/>
+      </w:pPr>
+      <w:r>
+        <w:rPr>
+          <w:rFonts w:ascii="Times New Roman" w:cs="Times New Roman" w:eastAsia="Times New Roman" w:hAnsi="Times New Roman"/>
+          <w:b/>
+          <w:bCs/>
+          <w:caps/>
+          <w:color w:val="7A2E4A"/>
+          <w:sz w:val="17"/>
+          <w:szCs w:val="17"/>
+        </w:rPr>
+        <w:t xml:space="preserve">do — </w:t>
+      </w:r>
+      <w:r>
+        <w:rPr>
+          <w:rFonts w:ascii="Times New Roman" w:cs="Times New Roman" w:eastAsia="Times New Roman" w:hAnsi="Times New Roman"/>
+          <w:i/>
+          <w:iCs/>
+          <w:color w:val="5F5F5F"/>
+          <w:sz w:val="19"/>
+          <w:szCs w:val="19"/>
+        </w:rPr>
+        <w:t xml:space="preserve">Point at the affected-quantity field, then at the two lines after saving.</w:t>
+      </w:r>
+    </w:p>
+    <w:p>
+      <w:pPr>
+        <w:spacing w:before="60" w:after="140"/>
+        <w:ind w:left="340"/>
+        <w:pBdr>
+          <w:left w:val="single" w:sz="18" w:space="8" w:color="491321"/>
+        </w:pBdr>
+      </w:pPr>
+      <w:r>
+        <w:rPr>
+          <w:rFonts w:ascii="Times New Roman" w:cs="Times New Roman" w:eastAsia="Times New Roman" w:hAnsi="Times New Roman"/>
+          <w:color w:val="1A1A1A"/>
+          <w:sz w:val="24"/>
+          <w:szCs w:val="24"/>
+        </w:rPr>
+        <w:t xml:space="preserve">The incident records twelve, not sixty, so the loss is not overstated against the contract.</w:t>
+      </w:r>
+    </w:p>
+    <w:p>
+      <w:pPr>
+        <w:spacing w:before="80" w:after="160"/>
+        <w:ind w:left="120"/>
+        <w:pBdr>
+          <w:top w:val="single" w:sz="4" w:color="B08699"/>
+          <w:left w:val="single" w:sz="4" w:color="B08699"/>
+          <w:bottom w:val="single" w:sz="4" w:color="B08699"/>
+          <w:right w:val="single" w:sz="4" w:color="B08699"/>
+        </w:pBdr>
+        <w:shd w:val="clear" w:fill="FBF6F8"/>
+      </w:pPr>
+      <w:r>
+        <w:rPr>
+          <w:rFonts w:ascii="Times New Roman" w:cs="Times New Roman" w:eastAsia="Times New Roman" w:hAnsi="Times New Roman"/>
+          <w:b/>
+          <w:bCs/>
+          <w:color w:val="7A2E4A"/>
+          <w:sz w:val="20"/>
+          <w:szCs w:val="20"/>
+        </w:rPr>
+        <w:t xml:space="preserve">Why the replacement is chosen from a list: </w:t>
+      </w:r>
+      <w:r>
+        <w:rPr>
+          <w:rFonts w:ascii="Times New Roman" w:cs="Times New Roman" w:eastAsia="Times New Roman" w:hAnsi="Times New Roman"/>
+          <w:color w:val="1A1A1A"/>
+          <w:sz w:val="20"/>
+          <w:szCs w:val="20"/>
+        </w:rPr>
+        <w:t xml:space="preserve">a typed name would create a contract line with no stock record behind it — the item would read as Not Linked with no availability, which is a worse position than the damage. The list offers only items of the same category that are actually available on this event date. Where nothing is available, the correct route is a purchase or rental request.</w:t>
       </w:r>
     </w:p>
     <w:p>
@@ -2412,7 +2492,59 @@
                 <w:sz w:val="19"/>
                 <w:szCs w:val="19"/>
               </w:rPr>
-              <w:t xml:space="preserve">The incident records the whole line. Splitting a line into damaged and intact parts is future work, and we would rather state that than imply otherwise.</w:t>
+              <w:t xml:space="preserve">Enter the affected count. The line splits: the intact units keep their item and stay prepared, only the replacements return to pending, and the incident records the affected count rather than the whole line.</w:t>
+            </w:r>
+          </w:p>
+        </w:tc>
+      </w:tr>
+      <w:tr>
+        <w:tc>
+          <w:tcPr>
+            <w:tcW w:type="dxa" w:w="3400"/>
+            <w:tcMar>
+              <w:top w:type="dxa" w:w="60"/>
+              <w:left w:type="dxa" w:w="90"/>
+              <w:bottom w:type="dxa" w:w="60"/>
+              <w:right w:type="dxa" w:w="90"/>
+            </w:tcMar>
+          </w:tcPr>
+          <w:p>
+            <w:pPr>
+              <w:spacing w:after="0" w:line="252"/>
+            </w:pPr>
+            <w:r>
+              <w:rPr>
+                <w:rFonts w:ascii="Times New Roman" w:cs="Times New Roman" w:eastAsia="Times New Roman" w:hAnsi="Times New Roman"/>
+                <w:color w:val="1A1A1A"/>
+                <w:sz w:val="19"/>
+                <w:szCs w:val="19"/>
+              </w:rPr>
+              <w:t xml:space="preserve">Can they type any replacement they like?</w:t>
+            </w:r>
+          </w:p>
+        </w:tc>
+        <w:tc>
+          <w:tcPr>
+            <w:tcW w:type="dxa" w:w="6000"/>
+            <w:tcMar>
+              <w:top w:type="dxa" w:w="60"/>
+              <w:left w:type="dxa" w:w="90"/>
+              <w:bottom w:type="dxa" w:w="60"/>
+              <w:right w:type="dxa" w:w="90"/>
+            </w:tcMar>
+          </w:tcPr>
+          <w:p>
+            <w:pPr>
+              <w:spacing w:after="0" w:line="252"/>
+            </w:pPr>
+            <w:r>
+              <w:rPr>
+                <w:rFonts w:ascii="Times New Roman" w:cs="Times New Roman" w:eastAsia="Times New Roman" w:hAnsi="Times New Roman"/>
+                <w:color w:val="1A1A1A"/>
+                <w:sz w:val="19"/>
+                <w:szCs w:val="19"/>
+              </w:rPr>
+              <w:t xml:space="preserve">No. It is chosen from stock of the same category that is available on this event date. A typed name would create a line with no inventory behind it — no availability, no stock record — which is worse than the damage it was meant to fix.</w:t>
             </w:r>
           </w:p>
         </w:tc>

</xml_diff>